<commit_message>
Implementada função do botão VENDER
</commit_message>
<xml_diff>
--- a/Relatorio ATV3.docx
+++ b/Relatorio ATV3.docx
@@ -512,6 +512,143 @@
         <w:t>melhorias</w:t>
       </w:r>
       <w:proofErr w:type="spellEnd"/>
+    </w:p>
+    <w:p>
+      <w:pPr>
+        <w:rPr>
+          <w:lang w:val="en-GB"/>
+        </w:rPr>
+      </w:pPr>
+    </w:p>
+    <w:p>
+      <w:pPr>
+        <w:pStyle w:val="PargrafodaLista"/>
+        <w:numPr>
+          <w:ilvl w:val="0"/>
+          <w:numId w:val="1"/>
+        </w:numPr>
+      </w:pPr>
+      <w:r>
+        <w:rPr>
+          <w:sz w:val="28"/>
+          <w:szCs w:val="28"/>
+        </w:rPr>
+        <w:t xml:space="preserve">Comandos para </w:t>
+      </w:r>
+      <w:proofErr w:type="spellStart"/>
+      <w:r>
+        <w:rPr>
+          <w:sz w:val="28"/>
+          <w:szCs w:val="28"/>
+        </w:rPr>
+        <w:t>Commit</w:t>
+      </w:r>
+      <w:proofErr w:type="spellEnd"/>
+      <w:r>
+        <w:rPr>
+          <w:sz w:val="28"/>
+          <w:szCs w:val="28"/>
+        </w:rPr>
+        <w:t xml:space="preserve"> </w:t>
+      </w:r>
+      <w:proofErr w:type="gramStart"/>
+      <w:r>
+        <w:rPr>
+          <w:sz w:val="28"/>
+          <w:szCs w:val="28"/>
+        </w:rPr>
+        <w:t>função Vender</w:t>
+      </w:r>
+      <w:proofErr w:type="gramEnd"/>
+      <w:r>
+        <w:rPr>
+          <w:sz w:val="28"/>
+          <w:szCs w:val="28"/>
+        </w:rPr>
+        <w:t>.</w:t>
+      </w:r>
+    </w:p>
+    <w:p>
+      <w:proofErr w:type="spellStart"/>
+      <w:r>
+        <w:t>git</w:t>
+      </w:r>
+      <w:proofErr w:type="spellEnd"/>
+      <w:r>
+        <w:t xml:space="preserve"> </w:t>
+      </w:r>
+      <w:proofErr w:type="spellStart"/>
+      <w:r>
+        <w:t>add</w:t>
+      </w:r>
+      <w:proofErr w:type="spellEnd"/>
+      <w:r>
+        <w:t xml:space="preserve"> </w:t>
+      </w:r>
+      <w:r>
+        <w:t>“</w:t>
+      </w:r>
+      <w:proofErr w:type="spellStart"/>
+      <w:r>
+        <w:t>Relatorio</w:t>
+      </w:r>
+      <w:proofErr w:type="spellEnd"/>
+      <w:r>
+        <w:t xml:space="preserve"> ATV3.do</w:t>
+      </w:r>
+      <w:r>
+        <w:t>cx”</w:t>
+      </w:r>
+      <w:r>
+        <w:t xml:space="preserve"> </w:t>
+      </w:r>
+      <w:proofErr w:type="spellStart"/>
+      <w:r>
+        <w:t>LeiloesTDSat</w:t>
+      </w:r>
+      <w:proofErr w:type="spellEnd"/>
+      <w:r>
+        <w:t>/*</w:t>
+      </w:r>
+    </w:p>
+    <w:p>
+      <w:r>
+        <w:t>git commit -m "</w:t>
+      </w:r>
+      <w:r>
+        <w:t>Implementada função do botão VENDER</w:t>
+      </w:r>
+      <w:r>
+        <w:t>"</w:t>
+      </w:r>
+    </w:p>
+    <w:p>
+      <w:pPr>
+        <w:rPr>
+          <w:lang w:val="en-GB"/>
+        </w:rPr>
+      </w:pPr>
+      <w:r>
+        <w:rPr>
+          <w:lang w:val="en-GB"/>
+        </w:rPr>
+        <w:t xml:space="preserve">git push -u origin </w:t>
+      </w:r>
+      <w:proofErr w:type="spellStart"/>
+      <w:r>
+        <w:rPr>
+          <w:lang w:val="en-GB"/>
+        </w:rPr>
+        <w:t>melhorias</w:t>
+      </w:r>
+      <w:proofErr w:type="spellEnd"/>
+    </w:p>
+    <w:p>
+      <w:pPr>
+        <w:rPr>
+          <w:lang w:val="en-GB"/>
+        </w:rPr>
+      </w:pPr>
     </w:p>
     <w:sectPr>
       <w:pgSz w:w="11906" w:h="16838"/>
@@ -526,6 +663,92 @@
 <file path=word/numbering.xml><?xml version="1.0" encoding="utf-8"?>
 <w:numbering xmlns:wpc="http://schemas.microsoft.com/office/word/2010/wordprocessingCanvas" xmlns:cx="http://schemas.microsoft.com/office/drawing/2014/chartex" xmlns:cx1="http://schemas.microsoft.com/office/drawing/2015/9/8/chartex" xmlns:cx2="http://schemas.microsoft.com/office/drawing/2015/10/21/chartex" xmlns:cx3="http://schemas.microsoft.com/office/drawing/2016/5/9/chartex" xmlns:cx4="http://schemas.microsoft.com/office/drawing/2016/5/10/chartex" xmlns:cx5="http://schemas.microsoft.com/office/drawing/2016/5/11/chartex" xmlns:cx6="http://schemas.microsoft.com/office/drawing/2016/5/12/chartex" xmlns:cx7="http://schemas.microsoft.com/office/drawing/2016/5/13/chartex" xmlns:cx8="http://schemas.microsoft.com/office/drawing/2016/5/14/chartex" xmlns:mc="http://schemas.openxmlformats.org/markup-compatibility/2006" xmlns:aink="http://schemas.microsoft.com/office/drawing/2016/ink" xmlns:am3d="http://schemas.microsoft.com/office/drawing/2017/model3d" xmlns:o="urn:schemas-microsoft-com:office:office" xmlns:oel="http://schemas.microsoft.com/office/2019/extlst" xmlns:r="http://schemas.openxmlformats.org/officeDocument/2006/relationships" xmlns:m="http://schemas.openxmlformats.org/officeDocument/2006/math" xmlns:v="urn:schemas-microsoft-com:vml" xmlns:wp14="http://schemas.microsoft.com/office/word/2010/wordprocessingDrawing" xmlns:wp="http://schemas.openxmlformats.org/drawingml/2006/wordprocessingDrawing" xmlns:w10="urn:schemas-microsoft-com:office:word" xmlns:w="http://schemas.openxmlformats.org/wordprocessingml/2006/main" xmlns:w14="http://schemas.microsoft.com/office/word/2010/wordml" xmlns:w15="http://schemas.microsoft.com/office/word/2012/wordml" xmlns:w16cex="http://schemas.microsoft.com/office/word/2018/wordml/cex" xmlns:w16cid="http://schemas.microsoft.com/office/word/2016/wordml/cid" xmlns:w16="http://schemas.microsoft.com/office/word/2018/wordml" xmlns:w16du="http://schemas.microsoft.com/office/word/2023/wordml/word16du" xmlns:w16sdtdh="http://schemas.microsoft.com/office/word/2020/wordml/sdtdatahash" xmlns:w16sdtfl="http://schemas.microsoft.com/office/word/2024/wordml/sdtformatlock" xmlns:w16se="http://schemas.microsoft.com/office/word/2015/wordml/symex" xmlns:wpg="http://schemas.microsoft.com/office/word/2010/wordprocessingGroup" xmlns:wpi="http://schemas.microsoft.com/office/word/2010/wordprocessingInk" xmlns:wne="http://schemas.microsoft.com/office/word/2006/wordml" xmlns:wps="http://schemas.microsoft.com/office/word/2010/wordprocessingShape" mc:Ignorable="w14 w15 w16se w16cid w16 w16cex w16sdtdh w16sdtfl w16du wp14">
   <w:abstractNum w:abstractNumId="0" w15:restartNumberingAfterBreak="0">
+    <w:nsid w:val="0CBC2C79"/>
+    <w:multiLevelType w:val="hybridMultilevel"/>
+    <w:tmpl w:val="FE3008D8"/>
+    <w:lvl w:ilvl="0" w:tplc="FFFFFFFF">
+      <w:start w:val="1"/>
+      <w:numFmt w:val="decimal"/>
+      <w:lvlText w:val="%1."/>
+      <w:lvlJc w:val="left"/>
+      <w:pPr>
+        <w:ind w:left="720" w:hanging="360"/>
+      </w:pPr>
+    </w:lvl>
+    <w:lvl w:ilvl="1" w:tplc="FFFFFFFF" w:tentative="1">
+      <w:start w:val="1"/>
+      <w:numFmt w:val="lowerLetter"/>
+      <w:lvlText w:val="%2."/>
+      <w:lvlJc w:val="left"/>
+      <w:pPr>
+        <w:ind w:left="1440" w:hanging="360"/>
+      </w:pPr>
+    </w:lvl>
+    <w:lvl w:ilvl="2" w:tplc="FFFFFFFF" w:tentative="1">
+      <w:start w:val="1"/>
+      <w:numFmt w:val="lowerRoman"/>
+      <w:lvlText w:val="%3."/>
+      <w:lvlJc w:val="right"/>
+      <w:pPr>
+        <w:ind w:left="2160" w:hanging="180"/>
+      </w:pPr>
+    </w:lvl>
+    <w:lvl w:ilvl="3" w:tplc="FFFFFFFF" w:tentative="1">
+      <w:start w:val="1"/>
+      <w:numFmt w:val="decimal"/>
+      <w:lvlText w:val="%4."/>
+      <w:lvlJc w:val="left"/>
+      <w:pPr>
+        <w:ind w:left="2880" w:hanging="360"/>
+      </w:pPr>
+    </w:lvl>
+    <w:lvl w:ilvl="4" w:tplc="FFFFFFFF" w:tentative="1">
+      <w:start w:val="1"/>
+      <w:numFmt w:val="lowerLetter"/>
+      <w:lvlText w:val="%5."/>
+      <w:lvlJc w:val="left"/>
+      <w:pPr>
+        <w:ind w:left="3600" w:hanging="360"/>
+      </w:pPr>
+    </w:lvl>
+    <w:lvl w:ilvl="5" w:tplc="FFFFFFFF" w:tentative="1">
+      <w:start w:val="1"/>
+      <w:numFmt w:val="lowerRoman"/>
+      <w:lvlText w:val="%6."/>
+      <w:lvlJc w:val="right"/>
+      <w:pPr>
+        <w:ind w:left="4320" w:hanging="180"/>
+      </w:pPr>
+    </w:lvl>
+    <w:lvl w:ilvl="6" w:tplc="FFFFFFFF" w:tentative="1">
+      <w:start w:val="1"/>
+      <w:numFmt w:val="decimal"/>
+      <w:lvlText w:val="%7."/>
+      <w:lvlJc w:val="left"/>
+      <w:pPr>
+        <w:ind w:left="5040" w:hanging="360"/>
+      </w:pPr>
+    </w:lvl>
+    <w:lvl w:ilvl="7" w:tplc="FFFFFFFF" w:tentative="1">
+      <w:start w:val="1"/>
+      <w:numFmt w:val="lowerLetter"/>
+      <w:lvlText w:val="%8."/>
+      <w:lvlJc w:val="left"/>
+      <w:pPr>
+        <w:ind w:left="5760" w:hanging="360"/>
+      </w:pPr>
+    </w:lvl>
+    <w:lvl w:ilvl="8" w:tplc="FFFFFFFF" w:tentative="1">
+      <w:start w:val="1"/>
+      <w:numFmt w:val="lowerRoman"/>
+      <w:lvlText w:val="%9."/>
+      <w:lvlJc w:val="right"/>
+      <w:pPr>
+        <w:ind w:left="6480" w:hanging="180"/>
+      </w:pPr>
+    </w:lvl>
+  </w:abstractNum>
+  <w:abstractNum w:abstractNumId="1" w15:restartNumberingAfterBreak="0">
     <w:nsid w:val="228E6A16"/>
     <w:multiLevelType w:val="hybridMultilevel"/>
     <w:tmpl w:val="D36EC5E4"/>
@@ -611,7 +834,7 @@
       </w:pPr>
     </w:lvl>
   </w:abstractNum>
-  <w:abstractNum w:abstractNumId="1" w15:restartNumberingAfterBreak="0">
+  <w:abstractNum w:abstractNumId="2" w15:restartNumberingAfterBreak="0">
     <w:nsid w:val="2A541830"/>
     <w:multiLevelType w:val="hybridMultilevel"/>
     <w:tmpl w:val="592C81D2"/>
@@ -697,10 +920,10 @@
       </w:pPr>
     </w:lvl>
   </w:abstractNum>
-  <w:abstractNum w:abstractNumId="2" w15:restartNumberingAfterBreak="0">
+  <w:abstractNum w:abstractNumId="3" w15:restartNumberingAfterBreak="0">
     <w:nsid w:val="3D3F5B0C"/>
     <w:multiLevelType w:val="hybridMultilevel"/>
-    <w:tmpl w:val="FE3008D8"/>
+    <w:tmpl w:val="631467E6"/>
     <w:lvl w:ilvl="0" w:tplc="0416000F">
       <w:start w:val="1"/>
       <w:numFmt w:val="decimal"/>
@@ -783,7 +1006,7 @@
       </w:pPr>
     </w:lvl>
   </w:abstractNum>
-  <w:abstractNum w:abstractNumId="3" w15:restartNumberingAfterBreak="0">
+  <w:abstractNum w:abstractNumId="4" w15:restartNumberingAfterBreak="0">
     <w:nsid w:val="4EA845A5"/>
     <w:multiLevelType w:val="hybridMultilevel"/>
     <w:tmpl w:val="7EFC1A6C"/>
@@ -869,7 +1092,7 @@
       </w:pPr>
     </w:lvl>
   </w:abstractNum>
-  <w:abstractNum w:abstractNumId="4" w15:restartNumberingAfterBreak="0">
+  <w:abstractNum w:abstractNumId="5" w15:restartNumberingAfterBreak="0">
     <w:nsid w:val="52DB5FBA"/>
     <w:multiLevelType w:val="hybridMultilevel"/>
     <w:tmpl w:val="48904C58"/>
@@ -955,7 +1178,7 @@
       </w:pPr>
     </w:lvl>
   </w:abstractNum>
-  <w:abstractNum w:abstractNumId="5" w15:restartNumberingAfterBreak="0">
+  <w:abstractNum w:abstractNumId="6" w15:restartNumberingAfterBreak="0">
     <w:nsid w:val="74540F9C"/>
     <w:multiLevelType w:val="hybridMultilevel"/>
     <w:tmpl w:val="5A62F768"/>
@@ -1042,22 +1265,25 @@
     </w:lvl>
   </w:abstractNum>
   <w:num w:numId="1" w16cid:durableId="2095710322">
+    <w:abstractNumId w:val="3"/>
+  </w:num>
+  <w:num w:numId="2" w16cid:durableId="225143678">
     <w:abstractNumId w:val="2"/>
   </w:num>
-  <w:num w:numId="2" w16cid:durableId="225143678">
+  <w:num w:numId="3" w16cid:durableId="203448340">
+    <w:abstractNumId w:val="4"/>
+  </w:num>
+  <w:num w:numId="4" w16cid:durableId="489293561">
+    <w:abstractNumId w:val="5"/>
+  </w:num>
+  <w:num w:numId="5" w16cid:durableId="441538904">
     <w:abstractNumId w:val="1"/>
   </w:num>
-  <w:num w:numId="3" w16cid:durableId="203448340">
-    <w:abstractNumId w:val="3"/>
+  <w:num w:numId="6" w16cid:durableId="25104795">
+    <w:abstractNumId w:val="6"/>
   </w:num>
-  <w:num w:numId="4" w16cid:durableId="489293561">
-    <w:abstractNumId w:val="4"/>
-  </w:num>
-  <w:num w:numId="5" w16cid:durableId="441538904">
+  <w:num w:numId="7" w16cid:durableId="1739739860">
     <w:abstractNumId w:val="0"/>
-  </w:num>
-  <w:num w:numId="6" w16cid:durableId="25104795">
-    <w:abstractNumId w:val="5"/>
   </w:num>
 </w:numbering>
 </file>
@@ -1462,7 +1688,7 @@
   <w:style w:type="paragraph" w:default="1" w:styleId="Normal">
     <w:name w:val="Normal"/>
     <w:qFormat/>
-    <w:rsid w:val="008C417A"/>
+    <w:rsid w:val="002A58D4"/>
   </w:style>
   <w:style w:type="paragraph" w:styleId="Ttulo1">
     <w:name w:val="heading 1"/>

</xml_diff>

<commit_message>
Criada a tela vendasView e configurado o botão Consultar Vendas para abri-la
</commit_message>
<xml_diff>
--- a/Relatorio ATV3.docx
+++ b/Relatorio ATV3.docx
@@ -100,21 +100,12 @@
         </w:rPr>
         <w:t xml:space="preserve">Comandos </w:t>
       </w:r>
-      <w:proofErr w:type="gramStart"/>
-      <w:r>
-        <w:rPr>
-          <w:sz w:val="28"/>
-          <w:szCs w:val="28"/>
-        </w:rPr>
-        <w:t>criar o novo</w:t>
-      </w:r>
-      <w:proofErr w:type="gramEnd"/>
-      <w:r>
-        <w:rPr>
-          <w:sz w:val="28"/>
-          <w:szCs w:val="28"/>
-        </w:rPr>
-        <w:t xml:space="preserve"> repositório</w:t>
+      <w:r>
+        <w:rPr>
+          <w:sz w:val="28"/>
+          <w:szCs w:val="28"/>
+        </w:rPr>
+        <w:t>criar o novo repositório</w:t>
       </w:r>
       <w:r>
         <w:rPr>
@@ -134,37 +125,21 @@
         <w:rPr>
           <w:lang w:val="en-GB"/>
         </w:rPr>
-        <w:t xml:space="preserve">git clone </w:t>
-      </w:r>
-      <w:proofErr w:type="gramStart"/>
-      <w:r>
-        <w:rPr>
-          <w:lang w:val="en-GB"/>
-        </w:rPr>
-        <w:t>https://github.com/ArturSilvaCosta/ATV2-UC11 .</w:t>
-      </w:r>
-      <w:proofErr w:type="gramEnd"/>
-    </w:p>
-    <w:p>
-      <w:pPr>
-        <w:rPr>
-          <w:lang w:val="en-GB"/>
-        </w:rPr>
-      </w:pPr>
-      <w:r>
-        <w:rPr>
-          <w:lang w:val="en-GB"/>
-        </w:rPr>
-        <w:t>rm -</w:t>
-      </w:r>
-      <w:proofErr w:type="gramStart"/>
-      <w:r>
-        <w:rPr>
-          <w:lang w:val="en-GB"/>
-        </w:rPr>
-        <w:t>rf .git</w:t>
-      </w:r>
-      <w:proofErr w:type="gramEnd"/>
+        <w:t>git clone https://github.com/ArturSilvaCosta/ATV2-UC11 .</w:t>
+      </w:r>
+    </w:p>
+    <w:p>
+      <w:pPr>
+        <w:rPr>
+          <w:lang w:val="en-GB"/>
+        </w:rPr>
+      </w:pPr>
+      <w:r>
+        <w:rPr>
+          <w:lang w:val="en-GB"/>
+        </w:rPr>
+        <w:t>rm -rf .git</w:t>
+      </w:r>
     </w:p>
     <w:p>
       <w:pPr>
@@ -236,16 +211,8 @@
         <w:rPr>
           <w:lang w:val="en-GB"/>
         </w:rPr>
-        <w:t xml:space="preserve">git </w:t>
-      </w:r>
-      <w:proofErr w:type="gramStart"/>
-      <w:r>
-        <w:rPr>
-          <w:lang w:val="en-GB"/>
-        </w:rPr>
-        <w:t>add .</w:t>
-      </w:r>
-      <w:proofErr w:type="gramEnd"/>
+        <w:t>git add .</w:t>
+      </w:r>
     </w:p>
     <w:p>
       <w:pPr>
@@ -551,7 +518,6 @@
         </w:rPr>
         <w:t xml:space="preserve"> </w:t>
       </w:r>
-      <w:proofErr w:type="gramStart"/>
       <w:r>
         <w:rPr>
           <w:sz w:val="28"/>
@@ -559,7 +525,6 @@
         </w:rPr>
         <w:t>função Vender</w:t>
       </w:r>
-      <w:proofErr w:type="gramEnd"/>
       <w:r>
         <w:rPr>
           <w:sz w:val="28"/>
@@ -612,8 +577,21 @@
       </w:r>
     </w:p>
     <w:p>
-      <w:r>
-        <w:t>git commit -m "</w:t>
+      <w:proofErr w:type="spellStart"/>
+      <w:r>
+        <w:t>git</w:t>
+      </w:r>
+      <w:proofErr w:type="spellEnd"/>
+      <w:r>
+        <w:t xml:space="preserve"> </w:t>
+      </w:r>
+      <w:proofErr w:type="spellStart"/>
+      <w:r>
+        <w:t>commit</w:t>
+      </w:r>
+      <w:proofErr w:type="spellEnd"/>
+      <w:r>
+        <w:t xml:space="preserve"> -m "</w:t>
       </w:r>
       <w:r>
         <w:t>Implementada função do botão VENDER</w:t>
@@ -642,6 +620,162 @@
         <w:t>melhorias</w:t>
       </w:r>
       <w:proofErr w:type="spellEnd"/>
+    </w:p>
+    <w:p>
+      <w:pPr>
+        <w:rPr>
+          <w:lang w:val="en-GB"/>
+        </w:rPr>
+      </w:pPr>
+    </w:p>
+    <w:p>
+      <w:pPr>
+        <w:pStyle w:val="PargrafodaLista"/>
+        <w:numPr>
+          <w:ilvl w:val="0"/>
+          <w:numId w:val="1"/>
+        </w:numPr>
+      </w:pPr>
+      <w:r>
+        <w:rPr>
+          <w:sz w:val="28"/>
+          <w:szCs w:val="28"/>
+        </w:rPr>
+        <w:t xml:space="preserve">Comandos para </w:t>
+      </w:r>
+      <w:proofErr w:type="spellStart"/>
+      <w:r>
+        <w:rPr>
+          <w:sz w:val="28"/>
+          <w:szCs w:val="28"/>
+        </w:rPr>
+        <w:t>Commit</w:t>
+      </w:r>
+      <w:proofErr w:type="spellEnd"/>
+      <w:r>
+        <w:rPr>
+          <w:sz w:val="28"/>
+          <w:szCs w:val="28"/>
+        </w:rPr>
+        <w:t xml:space="preserve"> </w:t>
+      </w:r>
+      <w:r>
+        <w:rPr>
+          <w:sz w:val="28"/>
+          <w:szCs w:val="28"/>
+        </w:rPr>
+        <w:t>nova tela de vendas</w:t>
+      </w:r>
+      <w:r>
+        <w:rPr>
+          <w:sz w:val="28"/>
+          <w:szCs w:val="28"/>
+        </w:rPr>
+        <w:t>.</w:t>
+      </w:r>
+    </w:p>
+    <w:p>
+      <w:proofErr w:type="spellStart"/>
+      <w:r>
+        <w:t>git</w:t>
+      </w:r>
+      <w:proofErr w:type="spellEnd"/>
+      <w:r>
+        <w:t xml:space="preserve"> </w:t>
+      </w:r>
+      <w:proofErr w:type="spellStart"/>
+      <w:r>
+        <w:t>add</w:t>
+      </w:r>
+      <w:proofErr w:type="spellEnd"/>
+      <w:r>
+        <w:t xml:space="preserve"> “</w:t>
+      </w:r>
+      <w:proofErr w:type="spellStart"/>
+      <w:r>
+        <w:t>Relatorio</w:t>
+      </w:r>
+      <w:proofErr w:type="spellEnd"/>
+      <w:r>
+        <w:t xml:space="preserve"> ATV3.do</w:t>
+      </w:r>
+      <w:r>
+        <w:t xml:space="preserve">cx” </w:t>
+      </w:r>
+      <w:proofErr w:type="spellStart"/>
+      <w:r>
+        <w:t>LeiloesTDSat</w:t>
+      </w:r>
+      <w:proofErr w:type="spellEnd"/>
+      <w:r>
+        <w:t>/*</w:t>
+      </w:r>
+    </w:p>
+    <w:p>
+      <w:proofErr w:type="spellStart"/>
+      <w:r>
+        <w:t>git</w:t>
+      </w:r>
+      <w:proofErr w:type="spellEnd"/>
+      <w:r>
+        <w:t xml:space="preserve"> </w:t>
+      </w:r>
+      <w:proofErr w:type="spellStart"/>
+      <w:r>
+        <w:t>commit</w:t>
+      </w:r>
+      <w:proofErr w:type="spellEnd"/>
+      <w:r>
+        <w:t xml:space="preserve"> -m "</w:t>
+      </w:r>
+      <w:r>
+        <w:t xml:space="preserve">Criada a tela </w:t>
+      </w:r>
+      <w:proofErr w:type="spellStart"/>
+      <w:r>
+        <w:t>vendasVIEW</w:t>
+      </w:r>
+      <w:proofErr w:type="spellEnd"/>
+      <w:r>
+        <w:t xml:space="preserve"> </w:t>
+      </w:r>
+      <w:r>
+        <w:t xml:space="preserve">e </w:t>
+      </w:r>
+      <w:r>
+        <w:t>configurado o botão Consultar Vendas</w:t>
+      </w:r>
+      <w:r>
+        <w:t>"</w:t>
+      </w:r>
+    </w:p>
+    <w:p>
+      <w:pPr>
+        <w:rPr>
+          <w:lang w:val="en-GB"/>
+        </w:rPr>
+      </w:pPr>
+      <w:r>
+        <w:rPr>
+          <w:lang w:val="en-GB"/>
+        </w:rPr>
+        <w:t xml:space="preserve">git push -u origin </w:t>
+      </w:r>
+      <w:proofErr w:type="spellStart"/>
+      <w:r>
+        <w:rPr>
+          <w:lang w:val="en-GB"/>
+        </w:rPr>
+        <w:t>melhorias</w:t>
+      </w:r>
+      <w:proofErr w:type="spellEnd"/>
+    </w:p>
+    <w:p>
+      <w:pPr>
+        <w:rPr>
+          <w:lang w:val="en-GB"/>
+        </w:rPr>
+      </w:pPr>
     </w:p>
     <w:p>
       <w:pPr>
@@ -923,7 +1057,7 @@
   <w:abstractNum w:abstractNumId="3" w15:restartNumberingAfterBreak="0">
     <w:nsid w:val="3D3F5B0C"/>
     <w:multiLevelType w:val="hybridMultilevel"/>
-    <w:tmpl w:val="631467E6"/>
+    <w:tmpl w:val="E4C8631E"/>
     <w:lvl w:ilvl="0" w:tplc="0416000F">
       <w:start w:val="1"/>
       <w:numFmt w:val="decimal"/>
@@ -1179,6 +1313,92 @@
     </w:lvl>
   </w:abstractNum>
   <w:abstractNum w:abstractNumId="6" w15:restartNumberingAfterBreak="0">
+    <w:nsid w:val="6CAD0897"/>
+    <w:multiLevelType w:val="hybridMultilevel"/>
+    <w:tmpl w:val="631467E6"/>
+    <w:lvl w:ilvl="0" w:tplc="FFFFFFFF">
+      <w:start w:val="1"/>
+      <w:numFmt w:val="decimal"/>
+      <w:lvlText w:val="%1."/>
+      <w:lvlJc w:val="left"/>
+      <w:pPr>
+        <w:ind w:left="720" w:hanging="360"/>
+      </w:pPr>
+    </w:lvl>
+    <w:lvl w:ilvl="1" w:tplc="FFFFFFFF" w:tentative="1">
+      <w:start w:val="1"/>
+      <w:numFmt w:val="lowerLetter"/>
+      <w:lvlText w:val="%2."/>
+      <w:lvlJc w:val="left"/>
+      <w:pPr>
+        <w:ind w:left="1440" w:hanging="360"/>
+      </w:pPr>
+    </w:lvl>
+    <w:lvl w:ilvl="2" w:tplc="FFFFFFFF" w:tentative="1">
+      <w:start w:val="1"/>
+      <w:numFmt w:val="lowerRoman"/>
+      <w:lvlText w:val="%3."/>
+      <w:lvlJc w:val="right"/>
+      <w:pPr>
+        <w:ind w:left="2160" w:hanging="180"/>
+      </w:pPr>
+    </w:lvl>
+    <w:lvl w:ilvl="3" w:tplc="FFFFFFFF" w:tentative="1">
+      <w:start w:val="1"/>
+      <w:numFmt w:val="decimal"/>
+      <w:lvlText w:val="%4."/>
+      <w:lvlJc w:val="left"/>
+      <w:pPr>
+        <w:ind w:left="2880" w:hanging="360"/>
+      </w:pPr>
+    </w:lvl>
+    <w:lvl w:ilvl="4" w:tplc="FFFFFFFF" w:tentative="1">
+      <w:start w:val="1"/>
+      <w:numFmt w:val="lowerLetter"/>
+      <w:lvlText w:val="%5."/>
+      <w:lvlJc w:val="left"/>
+      <w:pPr>
+        <w:ind w:left="3600" w:hanging="360"/>
+      </w:pPr>
+    </w:lvl>
+    <w:lvl w:ilvl="5" w:tplc="FFFFFFFF" w:tentative="1">
+      <w:start w:val="1"/>
+      <w:numFmt w:val="lowerRoman"/>
+      <w:lvlText w:val="%6."/>
+      <w:lvlJc w:val="right"/>
+      <w:pPr>
+        <w:ind w:left="4320" w:hanging="180"/>
+      </w:pPr>
+    </w:lvl>
+    <w:lvl w:ilvl="6" w:tplc="FFFFFFFF" w:tentative="1">
+      <w:start w:val="1"/>
+      <w:numFmt w:val="decimal"/>
+      <w:lvlText w:val="%7."/>
+      <w:lvlJc w:val="left"/>
+      <w:pPr>
+        <w:ind w:left="5040" w:hanging="360"/>
+      </w:pPr>
+    </w:lvl>
+    <w:lvl w:ilvl="7" w:tplc="FFFFFFFF" w:tentative="1">
+      <w:start w:val="1"/>
+      <w:numFmt w:val="lowerLetter"/>
+      <w:lvlText w:val="%8."/>
+      <w:lvlJc w:val="left"/>
+      <w:pPr>
+        <w:ind w:left="5760" w:hanging="360"/>
+      </w:pPr>
+    </w:lvl>
+    <w:lvl w:ilvl="8" w:tplc="FFFFFFFF" w:tentative="1">
+      <w:start w:val="1"/>
+      <w:numFmt w:val="lowerRoman"/>
+      <w:lvlText w:val="%9."/>
+      <w:lvlJc w:val="right"/>
+      <w:pPr>
+        <w:ind w:left="6480" w:hanging="180"/>
+      </w:pPr>
+    </w:lvl>
+  </w:abstractNum>
+  <w:abstractNum w:abstractNumId="7" w15:restartNumberingAfterBreak="0">
     <w:nsid w:val="74540F9C"/>
     <w:multiLevelType w:val="hybridMultilevel"/>
     <w:tmpl w:val="5A62F768"/>
@@ -1280,10 +1500,13 @@
     <w:abstractNumId w:val="1"/>
   </w:num>
   <w:num w:numId="6" w16cid:durableId="25104795">
-    <w:abstractNumId w:val="6"/>
+    <w:abstractNumId w:val="7"/>
   </w:num>
   <w:num w:numId="7" w16cid:durableId="1739739860">
     <w:abstractNumId w:val="0"/>
+  </w:num>
+  <w:num w:numId="8" w16cid:durableId="1246693580">
+    <w:abstractNumId w:val="6"/>
   </w:num>
 </w:numbering>
 </file>

</xml_diff>

<commit_message>
Implementado o filtro de vendas através do novo método listarProdutosVendidos()
</commit_message>
<xml_diff>
--- a/Relatorio ATV3.docx
+++ b/Relatorio ATV3.docx
@@ -100,12 +100,21 @@
         </w:rPr>
         <w:t xml:space="preserve">Comandos </w:t>
       </w:r>
-      <w:r>
-        <w:rPr>
-          <w:sz w:val="28"/>
-          <w:szCs w:val="28"/>
-        </w:rPr>
-        <w:t>criar o novo repositório</w:t>
+      <w:proofErr w:type="gramStart"/>
+      <w:r>
+        <w:rPr>
+          <w:sz w:val="28"/>
+          <w:szCs w:val="28"/>
+        </w:rPr>
+        <w:t>criar o novo</w:t>
+      </w:r>
+      <w:proofErr w:type="gramEnd"/>
+      <w:r>
+        <w:rPr>
+          <w:sz w:val="28"/>
+          <w:szCs w:val="28"/>
+        </w:rPr>
+        <w:t xml:space="preserve"> repositório</w:t>
       </w:r>
       <w:r>
         <w:rPr>
@@ -125,21 +134,37 @@
         <w:rPr>
           <w:lang w:val="en-GB"/>
         </w:rPr>
-        <w:t>git clone https://github.com/ArturSilvaCosta/ATV2-UC11 .</w:t>
-      </w:r>
-    </w:p>
-    <w:p>
-      <w:pPr>
-        <w:rPr>
-          <w:lang w:val="en-GB"/>
-        </w:rPr>
-      </w:pPr>
-      <w:r>
-        <w:rPr>
-          <w:lang w:val="en-GB"/>
-        </w:rPr>
-        <w:t>rm -rf .git</w:t>
-      </w:r>
+        <w:t xml:space="preserve">git clone </w:t>
+      </w:r>
+      <w:proofErr w:type="gramStart"/>
+      <w:r>
+        <w:rPr>
+          <w:lang w:val="en-GB"/>
+        </w:rPr>
+        <w:t>https://github.com/ArturSilvaCosta/ATV2-UC11 .</w:t>
+      </w:r>
+      <w:proofErr w:type="gramEnd"/>
+    </w:p>
+    <w:p>
+      <w:pPr>
+        <w:rPr>
+          <w:lang w:val="en-GB"/>
+        </w:rPr>
+      </w:pPr>
+      <w:r>
+        <w:rPr>
+          <w:lang w:val="en-GB"/>
+        </w:rPr>
+        <w:t>rm -</w:t>
+      </w:r>
+      <w:proofErr w:type="gramStart"/>
+      <w:r>
+        <w:rPr>
+          <w:lang w:val="en-GB"/>
+        </w:rPr>
+        <w:t>rf .git</w:t>
+      </w:r>
+      <w:proofErr w:type="gramEnd"/>
     </w:p>
     <w:p>
       <w:pPr>
@@ -211,8 +236,16 @@
         <w:rPr>
           <w:lang w:val="en-GB"/>
         </w:rPr>
-        <w:t>git add .</w:t>
-      </w:r>
+        <w:t xml:space="preserve">git </w:t>
+      </w:r>
+      <w:proofErr w:type="gramStart"/>
+      <w:r>
+        <w:rPr>
+          <w:lang w:val="en-GB"/>
+        </w:rPr>
+        <w:t>add .</w:t>
+      </w:r>
+      <w:proofErr w:type="gramEnd"/>
     </w:p>
     <w:p>
       <w:pPr>
@@ -518,6 +551,7 @@
         </w:rPr>
         <w:t xml:space="preserve"> </w:t>
       </w:r>
+      <w:proofErr w:type="gramStart"/>
       <w:r>
         <w:rPr>
           <w:sz w:val="28"/>
@@ -525,6 +559,7 @@
         </w:rPr>
         <w:t>função Vender</w:t>
       </w:r>
+      <w:proofErr w:type="gramEnd"/>
       <w:r>
         <w:rPr>
           <w:sz w:val="28"/>
@@ -744,6 +779,177 @@
       </w:r>
       <w:r>
         <w:t>configurado o botão Consultar Vendas</w:t>
+      </w:r>
+      <w:r>
+        <w:t xml:space="preserve"> para abri-la</w:t>
+      </w:r>
+      <w:r>
+        <w:t>"</w:t>
+      </w:r>
+    </w:p>
+    <w:p>
+      <w:pPr>
+        <w:rPr>
+          <w:lang w:val="en-GB"/>
+        </w:rPr>
+      </w:pPr>
+      <w:r>
+        <w:rPr>
+          <w:lang w:val="en-GB"/>
+        </w:rPr>
+        <w:t xml:space="preserve">git push -u origin </w:t>
+      </w:r>
+      <w:proofErr w:type="spellStart"/>
+      <w:r>
+        <w:rPr>
+          <w:lang w:val="en-GB"/>
+        </w:rPr>
+        <w:t>melhorias</w:t>
+      </w:r>
+      <w:proofErr w:type="spellEnd"/>
+    </w:p>
+    <w:p>
+      <w:pPr>
+        <w:rPr>
+          <w:lang w:val="en-GB"/>
+        </w:rPr>
+      </w:pPr>
+    </w:p>
+    <w:p>
+      <w:pPr>
+        <w:pStyle w:val="PargrafodaLista"/>
+        <w:numPr>
+          <w:ilvl w:val="0"/>
+          <w:numId w:val="1"/>
+        </w:numPr>
+      </w:pPr>
+      <w:r>
+        <w:rPr>
+          <w:sz w:val="28"/>
+          <w:szCs w:val="28"/>
+        </w:rPr>
+        <w:t xml:space="preserve">Comandos para </w:t>
+      </w:r>
+      <w:proofErr w:type="spellStart"/>
+      <w:r>
+        <w:rPr>
+          <w:sz w:val="28"/>
+          <w:szCs w:val="28"/>
+        </w:rPr>
+        <w:t>Commit</w:t>
+      </w:r>
+      <w:proofErr w:type="spellEnd"/>
+      <w:r>
+        <w:rPr>
+          <w:sz w:val="28"/>
+          <w:szCs w:val="28"/>
+        </w:rPr>
+        <w:t xml:space="preserve"> </w:t>
+      </w:r>
+      <w:r>
+        <w:rPr>
+          <w:sz w:val="28"/>
+          <w:szCs w:val="28"/>
+        </w:rPr>
+        <w:t xml:space="preserve">listagem </w:t>
+      </w:r>
+      <w:r>
+        <w:rPr>
+          <w:sz w:val="28"/>
+          <w:szCs w:val="28"/>
+        </w:rPr>
+        <w:t>de vendas</w:t>
+      </w:r>
+      <w:r>
+        <w:rPr>
+          <w:sz w:val="28"/>
+          <w:szCs w:val="28"/>
+        </w:rPr>
+        <w:t>.</w:t>
+      </w:r>
+    </w:p>
+    <w:p>
+      <w:proofErr w:type="spellStart"/>
+      <w:r>
+        <w:t>git</w:t>
+      </w:r>
+      <w:proofErr w:type="spellEnd"/>
+      <w:r>
+        <w:t xml:space="preserve"> </w:t>
+      </w:r>
+      <w:proofErr w:type="spellStart"/>
+      <w:r>
+        <w:t>add</w:t>
+      </w:r>
+      <w:proofErr w:type="spellEnd"/>
+      <w:r>
+        <w:t xml:space="preserve"> “</w:t>
+      </w:r>
+      <w:proofErr w:type="spellStart"/>
+      <w:r>
+        <w:t>Relatorio</w:t>
+      </w:r>
+      <w:proofErr w:type="spellEnd"/>
+      <w:r>
+        <w:t xml:space="preserve"> ATV3.do</w:t>
+      </w:r>
+      <w:r>
+        <w:t xml:space="preserve">cx” </w:t>
+      </w:r>
+      <w:proofErr w:type="spellStart"/>
+      <w:r>
+        <w:t>LeiloesTDSat</w:t>
+      </w:r>
+      <w:proofErr w:type="spellEnd"/>
+      <w:r>
+        <w:t>/*</w:t>
+      </w:r>
+    </w:p>
+    <w:p>
+      <w:proofErr w:type="spellStart"/>
+      <w:r>
+        <w:lastRenderedPageBreak/>
+        <w:t>git</w:t>
+      </w:r>
+      <w:proofErr w:type="spellEnd"/>
+      <w:r>
+        <w:t xml:space="preserve"> </w:t>
+      </w:r>
+      <w:proofErr w:type="spellStart"/>
+      <w:r>
+        <w:t>commit</w:t>
+      </w:r>
+      <w:proofErr w:type="spellEnd"/>
+      <w:r>
+        <w:t xml:space="preserve"> -m "</w:t>
+      </w:r>
+      <w:r>
+        <w:t xml:space="preserve">implementado o filtro de </w:t>
+      </w:r>
+      <w:r>
+        <w:t xml:space="preserve">vendas </w:t>
+      </w:r>
+      <w:r>
+        <w:t xml:space="preserve">através do </w:t>
+      </w:r>
+      <w:r>
+        <w:t xml:space="preserve">novo </w:t>
+      </w:r>
+      <w:r>
+        <w:t xml:space="preserve">método </w:t>
+      </w:r>
+      <w:proofErr w:type="spellStart"/>
+      <w:proofErr w:type="gramStart"/>
+      <w:r>
+        <w:t>listarProdutosVendidos</w:t>
+      </w:r>
+      <w:proofErr w:type="spellEnd"/>
+      <w:r>
+        <w:t>(</w:t>
+      </w:r>
+      <w:proofErr w:type="gramEnd"/>
+      <w:r>
+        <w:t>)</w:t>
       </w:r>
       <w:r>
         <w:t>"</w:t>
@@ -1057,7 +1263,7 @@
   <w:abstractNum w:abstractNumId="3" w15:restartNumberingAfterBreak="0">
     <w:nsid w:val="3D3F5B0C"/>
     <w:multiLevelType w:val="hybridMultilevel"/>
-    <w:tmpl w:val="E4C8631E"/>
+    <w:tmpl w:val="ACF2371A"/>
     <w:lvl w:ilvl="0" w:tplc="0416000F">
       <w:start w:val="1"/>
       <w:numFmt w:val="decimal"/>
@@ -1399,6 +1605,92 @@
     </w:lvl>
   </w:abstractNum>
   <w:abstractNum w:abstractNumId="7" w15:restartNumberingAfterBreak="0">
+    <w:nsid w:val="73EA29EE"/>
+    <w:multiLevelType w:val="hybridMultilevel"/>
+    <w:tmpl w:val="E4C8631E"/>
+    <w:lvl w:ilvl="0" w:tplc="FFFFFFFF">
+      <w:start w:val="1"/>
+      <w:numFmt w:val="decimal"/>
+      <w:lvlText w:val="%1."/>
+      <w:lvlJc w:val="left"/>
+      <w:pPr>
+        <w:ind w:left="720" w:hanging="360"/>
+      </w:pPr>
+    </w:lvl>
+    <w:lvl w:ilvl="1" w:tplc="FFFFFFFF" w:tentative="1">
+      <w:start w:val="1"/>
+      <w:numFmt w:val="lowerLetter"/>
+      <w:lvlText w:val="%2."/>
+      <w:lvlJc w:val="left"/>
+      <w:pPr>
+        <w:ind w:left="1440" w:hanging="360"/>
+      </w:pPr>
+    </w:lvl>
+    <w:lvl w:ilvl="2" w:tplc="FFFFFFFF" w:tentative="1">
+      <w:start w:val="1"/>
+      <w:numFmt w:val="lowerRoman"/>
+      <w:lvlText w:val="%3."/>
+      <w:lvlJc w:val="right"/>
+      <w:pPr>
+        <w:ind w:left="2160" w:hanging="180"/>
+      </w:pPr>
+    </w:lvl>
+    <w:lvl w:ilvl="3" w:tplc="FFFFFFFF" w:tentative="1">
+      <w:start w:val="1"/>
+      <w:numFmt w:val="decimal"/>
+      <w:lvlText w:val="%4."/>
+      <w:lvlJc w:val="left"/>
+      <w:pPr>
+        <w:ind w:left="2880" w:hanging="360"/>
+      </w:pPr>
+    </w:lvl>
+    <w:lvl w:ilvl="4" w:tplc="FFFFFFFF" w:tentative="1">
+      <w:start w:val="1"/>
+      <w:numFmt w:val="lowerLetter"/>
+      <w:lvlText w:val="%5."/>
+      <w:lvlJc w:val="left"/>
+      <w:pPr>
+        <w:ind w:left="3600" w:hanging="360"/>
+      </w:pPr>
+    </w:lvl>
+    <w:lvl w:ilvl="5" w:tplc="FFFFFFFF" w:tentative="1">
+      <w:start w:val="1"/>
+      <w:numFmt w:val="lowerRoman"/>
+      <w:lvlText w:val="%6."/>
+      <w:lvlJc w:val="right"/>
+      <w:pPr>
+        <w:ind w:left="4320" w:hanging="180"/>
+      </w:pPr>
+    </w:lvl>
+    <w:lvl w:ilvl="6" w:tplc="FFFFFFFF" w:tentative="1">
+      <w:start w:val="1"/>
+      <w:numFmt w:val="decimal"/>
+      <w:lvlText w:val="%7."/>
+      <w:lvlJc w:val="left"/>
+      <w:pPr>
+        <w:ind w:left="5040" w:hanging="360"/>
+      </w:pPr>
+    </w:lvl>
+    <w:lvl w:ilvl="7" w:tplc="FFFFFFFF" w:tentative="1">
+      <w:start w:val="1"/>
+      <w:numFmt w:val="lowerLetter"/>
+      <w:lvlText w:val="%8."/>
+      <w:lvlJc w:val="left"/>
+      <w:pPr>
+        <w:ind w:left="5760" w:hanging="360"/>
+      </w:pPr>
+    </w:lvl>
+    <w:lvl w:ilvl="8" w:tplc="FFFFFFFF" w:tentative="1">
+      <w:start w:val="1"/>
+      <w:numFmt w:val="lowerRoman"/>
+      <w:lvlText w:val="%9."/>
+      <w:lvlJc w:val="right"/>
+      <w:pPr>
+        <w:ind w:left="6480" w:hanging="180"/>
+      </w:pPr>
+    </w:lvl>
+  </w:abstractNum>
+  <w:abstractNum w:abstractNumId="8" w15:restartNumberingAfterBreak="0">
     <w:nsid w:val="74540F9C"/>
     <w:multiLevelType w:val="hybridMultilevel"/>
     <w:tmpl w:val="5A62F768"/>
@@ -1500,13 +1792,16 @@
     <w:abstractNumId w:val="1"/>
   </w:num>
   <w:num w:numId="6" w16cid:durableId="25104795">
-    <w:abstractNumId w:val="7"/>
+    <w:abstractNumId w:val="8"/>
   </w:num>
   <w:num w:numId="7" w16cid:durableId="1739739860">
     <w:abstractNumId w:val="0"/>
   </w:num>
   <w:num w:numId="8" w16cid:durableId="1246693580">
     <w:abstractNumId w:val="6"/>
+  </w:num>
+  <w:num w:numId="9" w16cid:durableId="1067806922">
+    <w:abstractNumId w:val="7"/>
   </w:num>
 </w:numbering>
 </file>
@@ -1911,7 +2206,7 @@
   <w:style w:type="paragraph" w:default="1" w:styleId="Normal">
     <w:name w:val="Normal"/>
     <w:qFormat/>
-    <w:rsid w:val="002A58D4"/>
+    <w:rsid w:val="0049189E"/>
   </w:style>
   <w:style w:type="paragraph" w:styleId="Ttulo1">
     <w:name w:val="heading 1"/>

</xml_diff>